<commit_message>
Orcamento MS.015: numeracao sequencial, tabela de artigos e editor RH
Co-authored-by: Cursor <cursoragent@cursor.com>
</commit_message>
<xml_diff>
--- a/pwa/assets/templates/MS.015-orcamento-template.docx
+++ b/pwa/assets/templates/MS.015-orcamento-template.docx
@@ -96,7 +96,7 @@
                       <w:sz w:val="24"/>
                       <w:szCs w:val="24"/>
                     </w:rPr>
-                    <w:t>{cliente_nome}</w:t>
+                    <w:t>VISTA ALEGRE</w:t>
                   </w:r>
                 </w:p>
                 <w:p>
@@ -161,7 +161,7 @@
                       <w:sz w:val="24"/>
                       <w:szCs w:val="24"/>
                     </w:rPr>
-                    <w:t>{cliente_ac}</w:t>
+                    <w:t>º CARLOS LUÍS</w:t>
                   </w:r>
                 </w:p>
                 <w:p>
@@ -283,29 +283,155 @@
         </w:rPr>
       </w:pPr>
     </w:p>
-    <w:p w14:paraId="MS015ORC1" w14:textId="MS015ORC1" w:rsidR="00MS0150" w:rsidRDefault="00MS0150">
-      <w:pPr>
-        <w:spacing w:after="0"/>
-      </w:pPr>
-      <w:r>
-        <w:rPr>
-          <w:b/>
-          <w:sz w:val="24"/>
-          <w:szCs w:val="24"/>
-        </w:rPr>
-        <w:t>Orçamento nº {orcamento_numero}</w:t>
-      </w:r>
-    </w:p>
-    <w:p w14:paraId="MS015ORC2" w14:textId="MS015ORC2" w:rsidR="00MS0150" w:rsidRDefault="00MS0150">
-      <w:pPr>
-        <w:spacing w:after="0"/>
-      </w:pPr>
-      <w:r>
-        <w:rPr>
-          <w:sz w:val="24"/>
-          <w:szCs w:val="24"/>
-        </w:rPr>
-        <w:t>{data_extenso}</w:t>
+    <w:p>
+      <w:pPr>
+        <w:pStyle w:val="SemEspaamento"/>
+        <w:rPr>
+          <w:b/>
+          <w:bCs/>
+          <w:sz w:val="24"/>
+          <w:szCs w:val="24"/>
+          <w:u w:val="single"/>
+        </w:rPr>
+      </w:pPr>
+      <w:r>
+        <w:rPr>
+          <w:b/>
+          <w:bCs/>
+          <w:sz w:val="24"/>
+          <w:szCs w:val="24"/>
+          <w:u w:val="single"/>
+        </w:rPr>
+        <w:t>Orça</w:t>
+      </w:r>
+      <w:r>
+        <w:rPr>
+          <w:b/>
+          <w:bCs/>
+          <w:sz w:val="24"/>
+          <w:szCs w:val="24"/>
+          <w:u w:val="single"/>
+        </w:rPr>
+        <w:t>m</w:t>
+      </w:r>
+      <w:r>
+        <w:rPr>
+          <w:b/>
+          <w:bCs/>
+          <w:sz w:val="24"/>
+          <w:szCs w:val="24"/>
+          <w:u w:val="single"/>
+        </w:rPr>
+        <w:t>ento nº</w:t>
+      </w:r>
+      <w:r>
+        <w:rPr>
+          <w:b/>
+          <w:bCs/>
+          <w:sz w:val="24"/>
+          <w:szCs w:val="24"/>
+          <w:u w:val="single"/>
+        </w:rPr>
+        <w:t>2</w:t>
+      </w:r>
+      <w:r>
+        <w:rPr>
+          <w:b/>
+          <w:bCs/>
+          <w:sz w:val="24"/>
+          <w:szCs w:val="24"/>
+          <w:u w:val="single"/>
+        </w:rPr>
+        <w:t>9</w:t>
+      </w:r>
+      <w:r>
+        <w:rPr>
+          <w:b/>
+          <w:bCs/>
+          <w:sz w:val="24"/>
+          <w:szCs w:val="24"/>
+          <w:u w:val="single"/>
+        </w:rPr>
+        <w:t>6</w:t>
+      </w:r>
+      <w:r>
+        <w:rPr>
+          <w:b/>
+          <w:bCs/>
+          <w:sz w:val="24"/>
+          <w:szCs w:val="24"/>
+          <w:u w:val="single"/>
+        </w:rPr>
+        <w:t>.</w:t>
+      </w:r>
+      <w:r>
+        <w:rPr>
+          <w:b/>
+          <w:bCs/>
+          <w:sz w:val="24"/>
+          <w:szCs w:val="24"/>
+          <w:u w:val="single"/>
+        </w:rPr>
+        <w:t>0</w:t>
+      </w:r>
+      <w:r>
+        <w:rPr>
+          <w:b/>
+          <w:bCs/>
+          <w:sz w:val="24"/>
+          <w:szCs w:val="24"/>
+          <w:u w:val="single"/>
+        </w:rPr>
+        <w:t>/202</w:t>
+      </w:r>
+      <w:r>
+        <w:rPr>
+          <w:b/>
+          <w:bCs/>
+          <w:sz w:val="24"/>
+          <w:szCs w:val="24"/>
+          <w:u w:val="single"/>
+        </w:rPr>
+        <w:t>6</w:t>
+      </w:r>
+    </w:p>
+    <w:p>
+      <w:pPr>
+        <w:pStyle w:val="SemEspaamento"/>
+        <w:rPr>
+          <w:sz w:val="24"/>
+          <w:szCs w:val="24"/>
+        </w:rPr>
+      </w:pPr>
+      <w:r>
+        <w:rPr>
+          <w:sz w:val="24"/>
+          <w:szCs w:val="24"/>
+        </w:rPr>
+        <w:t>22</w:t>
+      </w:r>
+      <w:r>
+        <w:rPr>
+          <w:sz w:val="24"/>
+          <w:szCs w:val="24"/>
+        </w:rPr>
+        <w:t xml:space="preserve"> de </w:t>
+      </w:r>
+      <w:proofErr w:type="gramStart"/>
+      <w:r>
+        <w:rPr>
+          <w:sz w:val="24"/>
+          <w:szCs w:val="24"/>
+        </w:rPr>
+        <w:t>Junho</w:t>
+      </w:r>
+      <w:proofErr w:type="gramEnd"/>
+      <w:r>
+        <w:rPr>
+          <w:sz w:val="24"/>
+          <w:szCs w:val="24"/>
+        </w:rPr>
+        <w:t xml:space="preserve"> 2026</w:t>
       </w:r>
     </w:p>
     <w:p>
@@ -359,7 +485,7 @@
           <w:szCs w:val="24"/>
           <w:lang w:eastAsia="en-US"/>
         </w:rPr>
-        <w:t>{intro_servico}</w:t>
+        <w:t>a reparação das seguintes baterias:</w:t>
       </w:r>
     </w:p>
     <w:p>
@@ -402,7 +528,7 @@
           <w:szCs w:val="24"/>
           <w:lang w:eastAsia="en-US"/>
         </w:rPr>
-        <w:t xml:space="preserve">Máquina – {maquina}</w:t>
+        <w:t xml:space="preserve">Máquina – </w:t>
       </w:r>
     </w:p>
     <w:p>
@@ -431,7 +557,7 @@
           <w:szCs w:val="24"/>
           <w:lang w:eastAsia="en-US"/>
         </w:rPr>
-        <w:t xml:space="preserve">Matrícula: {matricula}</w:t>
+        <w:t xml:space="preserve">Matrícula: </w:t>
       </w:r>
     </w:p>
     <w:p>
@@ -480,15 +606,6 @@
           <w:lang w:eastAsia="en-US"/>
         </w:rPr>
         <w:t>Na reparação precisa:</w:t>
-      </w:r>
-    </w:p>
-    <w:p>
-      <w:r>
-        <w:rPr>
-          <w:sz w:val="24"/>
-          <w:szCs w:val="24"/>
-        </w:rPr>
-        <w:t xml:space="preserve">{reparacao_necessaria}</w:t>
       </w:r>
     </w:p>
     <w:p>

</xml_diff>

<commit_message>
MS.015: campos completos da proposta no formulario RH (cliente, maquina, pagamento)
Co-authored-by: Cursor <cursoragent@cursor.com>
</commit_message>
<xml_diff>
--- a/pwa/assets/templates/MS.015-orcamento-template.docx
+++ b/pwa/assets/templates/MS.015-orcamento-template.docx
@@ -96,7 +96,7 @@
                       <w:sz w:val="24"/>
                       <w:szCs w:val="24"/>
                     </w:rPr>
-                    <w:t>VISTA ALEGRE</w:t>
+                    <w:t>{cliente_nome}</w:t>
                   </w:r>
                 </w:p>
                 <w:p>
@@ -161,7 +161,7 @@
                       <w:sz w:val="24"/>
                       <w:szCs w:val="24"/>
                     </w:rPr>
-                    <w:t>º CARLOS LUÍS</w:t>
+                    <w:t>{cliente_ac}</w:t>
                   </w:r>
                 </w:p>
                 <w:p>
@@ -283,155 +283,29 @@
         </w:rPr>
       </w:pPr>
     </w:p>
-    <w:p>
-      <w:pPr>
-        <w:pStyle w:val="SemEspaamento"/>
+    <w:p w14:paraId="MS015ORC1" w14:textId="MS015ORC1" w:rsidR="00MS0150" w:rsidRDefault="00MS0150">
+      <w:pPr>
+        <w:spacing w:after="0"/>
+      </w:pPr>
+      <w:r>
         <w:rPr>
           <w:b/>
-          <w:bCs/>
           <w:sz w:val="24"/>
           <w:szCs w:val="24"/>
-          <w:u w:val="single"/>
-        </w:rPr>
-      </w:pPr>
-      <w:r>
-        <w:rPr>
-          <w:b/>
-          <w:bCs/>
+        </w:rPr>
+        <w:t>Orçamento nº {orcamento_numero}</w:t>
+      </w:r>
+    </w:p>
+    <w:p w14:paraId="MS015ORC2" w14:textId="MS015ORC2" w:rsidR="00MS0150" w:rsidRDefault="00MS0150">
+      <w:pPr>
+        <w:spacing w:after="0"/>
+      </w:pPr>
+      <w:r>
+        <w:rPr>
           <w:sz w:val="24"/>
           <w:szCs w:val="24"/>
-          <w:u w:val="single"/>
-        </w:rPr>
-        <w:t>Orça</w:t>
-      </w:r>
-      <w:r>
-        <w:rPr>
-          <w:b/>
-          <w:bCs/>
-          <w:sz w:val="24"/>
-          <w:szCs w:val="24"/>
-          <w:u w:val="single"/>
-        </w:rPr>
-        <w:t>m</w:t>
-      </w:r>
-      <w:r>
-        <w:rPr>
-          <w:b/>
-          <w:bCs/>
-          <w:sz w:val="24"/>
-          <w:szCs w:val="24"/>
-          <w:u w:val="single"/>
-        </w:rPr>
-        <w:t>ento nº</w:t>
-      </w:r>
-      <w:r>
-        <w:rPr>
-          <w:b/>
-          <w:bCs/>
-          <w:sz w:val="24"/>
-          <w:szCs w:val="24"/>
-          <w:u w:val="single"/>
-        </w:rPr>
-        <w:t>2</w:t>
-      </w:r>
-      <w:r>
-        <w:rPr>
-          <w:b/>
-          <w:bCs/>
-          <w:sz w:val="24"/>
-          <w:szCs w:val="24"/>
-          <w:u w:val="single"/>
-        </w:rPr>
-        <w:t>9</w:t>
-      </w:r>
-      <w:r>
-        <w:rPr>
-          <w:b/>
-          <w:bCs/>
-          <w:sz w:val="24"/>
-          <w:szCs w:val="24"/>
-          <w:u w:val="single"/>
-        </w:rPr>
-        <w:t>6</w:t>
-      </w:r>
-      <w:r>
-        <w:rPr>
-          <w:b/>
-          <w:bCs/>
-          <w:sz w:val="24"/>
-          <w:szCs w:val="24"/>
-          <w:u w:val="single"/>
-        </w:rPr>
-        <w:t>.</w:t>
-      </w:r>
-      <w:r>
-        <w:rPr>
-          <w:b/>
-          <w:bCs/>
-          <w:sz w:val="24"/>
-          <w:szCs w:val="24"/>
-          <w:u w:val="single"/>
-        </w:rPr>
-        <w:t>0</w:t>
-      </w:r>
-      <w:r>
-        <w:rPr>
-          <w:b/>
-          <w:bCs/>
-          <w:sz w:val="24"/>
-          <w:szCs w:val="24"/>
-          <w:u w:val="single"/>
-        </w:rPr>
-        <w:t>/202</w:t>
-      </w:r>
-      <w:r>
-        <w:rPr>
-          <w:b/>
-          <w:bCs/>
-          <w:sz w:val="24"/>
-          <w:szCs w:val="24"/>
-          <w:u w:val="single"/>
-        </w:rPr>
-        <w:t>6</w:t>
-      </w:r>
-    </w:p>
-    <w:p>
-      <w:pPr>
-        <w:pStyle w:val="SemEspaamento"/>
-        <w:rPr>
-          <w:sz w:val="24"/>
-          <w:szCs w:val="24"/>
-        </w:rPr>
-      </w:pPr>
-      <w:r>
-        <w:rPr>
-          <w:sz w:val="24"/>
-          <w:szCs w:val="24"/>
-        </w:rPr>
-        <w:t>22</w:t>
-      </w:r>
-      <w:r>
-        <w:rPr>
-          <w:sz w:val="24"/>
-          <w:szCs w:val="24"/>
-        </w:rPr>
-        <w:t xml:space="preserve"> de </w:t>
-      </w:r>
-      <w:proofErr w:type="gramStart"/>
-      <w:r>
-        <w:rPr>
-          <w:sz w:val="24"/>
-          <w:szCs w:val="24"/>
-        </w:rPr>
-        <w:t>Junho</w:t>
-      </w:r>
-      <w:proofErr w:type="gramEnd"/>
-      <w:r>
-        <w:rPr>
-          <w:sz w:val="24"/>
-          <w:szCs w:val="24"/>
-        </w:rPr>
-        <w:t xml:space="preserve"> 2026</w:t>
+        </w:rPr>
+        <w:t>{data_extenso}</w:t>
       </w:r>
     </w:p>
     <w:p>
@@ -485,7 +359,7 @@
           <w:szCs w:val="24"/>
           <w:lang w:eastAsia="en-US"/>
         </w:rPr>
-        <w:t>a reparação das seguintes baterias:</w:t>
+        <w:t>{intro_servico}</w:t>
       </w:r>
     </w:p>
     <w:p>
@@ -528,7 +402,7 @@
           <w:szCs w:val="24"/>
           <w:lang w:eastAsia="en-US"/>
         </w:rPr>
-        <w:t xml:space="preserve">Máquina – </w:t>
+        <w:t xml:space="preserve">Máquina – {maquina}</w:t>
       </w:r>
     </w:p>
     <w:p>
@@ -557,7 +431,7 @@
           <w:szCs w:val="24"/>
           <w:lang w:eastAsia="en-US"/>
         </w:rPr>
-        <w:t xml:space="preserve">Matrícula: </w:t>
+        <w:t xml:space="preserve">Matrícula: {matricula}</w:t>
       </w:r>
     </w:p>
     <w:p>
@@ -609,6 +483,15 @@
       </w:r>
     </w:p>
     <w:p>
+      <w:r>
+        <w:rPr>
+          <w:sz w:val="24"/>
+          <w:szCs w:val="24"/>
+        </w:rPr>
+        <w:t xml:space="preserve">{reparacao_necessaria}</w:t>
+      </w:r>
+    </w:p>
+    <w:p>
       <w:pPr>
         <w:autoSpaceDE w:val="0"/>
         <w:autoSpaceDN w:val="0"/>
@@ -819,42 +702,30 @@
         </w:rPr>
       </w:pPr>
     </w:p>
-    <w:p>
-      <w:pPr>
-        <w:autoSpaceDE w:val="0"/>
-        <w:autoSpaceDN w:val="0"/>
-        <w:adjustRightInd w:val="0"/>
-        <w:spacing w:after="0" w:line="240" w:lineRule="auto"/>
-        <w:rPr>
-          <w:rFonts w:ascii="Calibri-Bold" w:eastAsiaTheme="minorHAnsi" w:hAnsi="Calibri-Bold" w:cs="Calibri-Bold"/>
-          <w:color w:val="auto"/>
+    <w:p w14:paraId="MS015TBL0" w14:textId="MS015TBL0" w:rsidR="00MS0150" w:rsidRDefault="00MS0150">
+      <w:pPr>
+        <w:spacing w:after="120" w:line="240" w:lineRule="auto"/>
+      </w:pPr>
+      <w:r>
+        <w:rPr>
+          <w:sz w:val="20"/>
+          <w:szCs w:val="20"/>
+        </w:rPr>
+        <w:t>[[TABELA_ORCAMENTO]]</w:t>
+      </w:r>
+    </w:p>
+    <w:p w14:paraId="MS015TX1" w14:textId="MS015TX1" w:rsidR="00MS0150" w:rsidRDefault="00MS0150">
+      <w:pPr>
+        <w:spacing w:after="0"/>
+      </w:pPr>
+      <w:r>
+        <w:rPr>
+          <w:b/>
           <w:sz w:val="24"/>
           <w:szCs w:val="24"/>
-          <w:lang w:eastAsia="en-US"/>
-        </w:rPr>
-      </w:pPr>
-      <w:r>
-        <w:rPr>
-          <w:rFonts w:ascii="Calibri-Bold" w:eastAsiaTheme="minorHAnsi" w:hAnsi="Calibri-Bold" w:cs="Calibri-Bold"/>
-          <w:color w:val="auto"/>
-          <w:sz w:val="24"/>
-          <w:szCs w:val="24"/>
-          <w:lang w:eastAsia="en-US"/>
-        </w:rPr>
-        <w:t xml:space="preserve">Taxa de Saída </w:t>
-      </w:r>
-      <w:proofErr w:type="gramStart"/>
-      <w:r>
-        <w:rPr>
-          <w:rFonts w:ascii="Calibri-Bold" w:eastAsiaTheme="minorHAnsi" w:hAnsi="Calibri-Bold" w:cs="Calibri-Bold"/>
-          <w:color w:val="auto"/>
-          <w:sz w:val="24"/>
-          <w:szCs w:val="24"/>
-          <w:lang w:eastAsia="en-US"/>
-        </w:rPr>
-        <w:t>–  €</w:t>
-      </w:r>
-      <w:proofErr w:type="gramEnd"/>
+        </w:rPr>
+        <w:t xml:space="preserve">Taxa de Saída – {taxa_saida} €</w:t>
+      </w:r>
     </w:p>
     <w:p>
       <w:pPr>
@@ -889,17 +760,22 @@
         </w:rPr>
       </w:pPr>
     </w:p>
-    <w:p>
-      <w:pPr>
-        <w:pStyle w:val="SemEspaamento"/>
-        <w:tabs>
-          <w:tab w:val="left" w:pos="5955"/>
-        </w:tabs>
+    <w:p w14:paraId="MS015PZ1" w14:textId="MS015PZ1" w:rsidR="00MS0150" w:rsidRDefault="00MS0150">
+      <w:pPr>
+        <w:spacing w:after="0"/>
+      </w:pPr>
+      <w:r>
         <w:rPr>
           <w:sz w:val="24"/>
           <w:szCs w:val="24"/>
           <w:u w:val="single"/>
         </w:rPr>
+        <w:t xml:space="preserve">Prazo de Entrega: {prazo_entrega}</w:t>
+      </w:r>
+    </w:p>
+    <w:p w14:paraId="MS015FP1" w14:textId="MS015FP1" w:rsidR="00MS0150" w:rsidRDefault="00MS0150">
+      <w:pPr>
+        <w:spacing w:after="0"/>
       </w:pPr>
       <w:r>
         <w:rPr>
@@ -907,115 +783,58 @@
           <w:szCs w:val="24"/>
           <w:u w:val="single"/>
         </w:rPr>
-        <w:t>Prazo de Entrega</w:t>
-      </w:r>
+        <w:t xml:space="preserve">Forma de Pagamento: {forma_pagamento}</w:t>
+      </w:r>
+    </w:p>
+    <w:p w14:paraId="MS015VD1" w14:textId="MS015VD1" w:rsidR="00MS0150" w:rsidRDefault="00MS0150">
+      <w:pPr>
+        <w:spacing w:after="0"/>
+      </w:pPr>
       <w:r>
         <w:rPr>
           <w:sz w:val="24"/>
           <w:szCs w:val="24"/>
           <w:u w:val="single"/>
         </w:rPr>
-        <w:t xml:space="preserve">: </w:t>
-      </w:r>
-    </w:p>
-    <w:p>
-      <w:pPr>
-        <w:pStyle w:val="SemEspaamento"/>
-        <w:rPr>
-          <w:rFonts w:cs="Times New Roman"/>
-          <w:sz w:val="24"/>
-          <w:szCs w:val="24"/>
-          <w:u w:val="single"/>
-        </w:rPr>
-      </w:pPr>
-      <w:r>
-        <w:rPr>
-          <w:rFonts w:cs="Times New Roman"/>
-          <w:sz w:val="24"/>
-          <w:szCs w:val="24"/>
-          <w:u w:val="single"/>
-        </w:rPr>
-        <w:t>Forma de Paga</w:t>
-      </w:r>
-      <w:r>
-        <w:rPr>
-          <w:rFonts w:cs="Times New Roman"/>
-          <w:sz w:val="24"/>
-          <w:szCs w:val="24"/>
-          <w:u w:val="single"/>
-        </w:rPr>
-        <w:t>mento</w:t>
-      </w:r>
-      <w:r>
-        <w:rPr>
-          <w:rFonts w:cs="Times New Roman"/>
-          <w:sz w:val="24"/>
-          <w:szCs w:val="24"/>
-          <w:u w:val="single"/>
-        </w:rPr>
-        <w:t xml:space="preserve">: </w:t>
-      </w:r>
-      <w:r>
-        <w:rPr>
-          <w:rFonts w:cs="Times New Roman"/>
-          <w:sz w:val="24"/>
-          <w:szCs w:val="24"/>
-          <w:u w:val="single"/>
-        </w:rPr>
-        <w:t>Pronto Pagamento</w:t>
-      </w:r>
-    </w:p>
-    <w:p>
-      <w:pPr>
-        <w:pStyle w:val="SemEspaamento"/>
-        <w:rPr>
-          <w:rFonts w:cs="Times New Roman"/>
+        <w:t xml:space="preserve">Validade do orçamento – {validade_orcamento}</w:t>
+      </w:r>
+    </w:p>
+    <w:p w14:paraId="MS015TT1" w14:textId="MS015TT1" w:rsidR="00MS0150" w:rsidRDefault="00MS0150">
+      <w:pPr>
+        <w:spacing w:after="0"/>
+      </w:pPr>
+      <w:r>
+        <w:rPr>
           <w:b/>
-          <w:bCs/>
-          <w:sz w:val="24"/>
-          <w:szCs w:val="24"/>
-          <w:u w:val="single"/>
-        </w:rPr>
-      </w:pPr>
-      <w:r>
-        <w:rPr>
-          <w:rFonts w:cs="Times New Roman"/>
-          <w:sz w:val="24"/>
-          <w:szCs w:val="24"/>
-          <w:u w:val="single"/>
-        </w:rPr>
-        <w:t>Validade do orçamento –</w:t>
-      </w:r>
-      <w:r>
-        <w:rPr>
-          <w:rFonts w:cs="Times New Roman"/>
-          <w:sz w:val="24"/>
-          <w:szCs w:val="24"/>
-          <w:u w:val="single"/>
-        </w:rPr>
-        <w:t xml:space="preserve"> </w:t>
-      </w:r>
-      <w:r>
-        <w:rPr>
-          <w:rFonts w:cs="Times New Roman"/>
+          <w:sz w:val="22"/>
+          <w:szCs w:val="22"/>
+        </w:rPr>
+        <w:t xml:space="preserve">Subtotal (s/ IVA): {subtotal} €</w:t>
+      </w:r>
+    </w:p>
+    <w:p w14:paraId="MS015TT2" w14:textId="MS015TT2" w:rsidR="00MS0150" w:rsidRDefault="00MS0150">
+      <w:pPr>
+        <w:spacing w:after="0"/>
+      </w:pPr>
+      <w:r>
+        <w:rPr>
+          <w:sz w:val="22"/>
+          <w:szCs w:val="22"/>
+        </w:rPr>
+        <w:t xml:space="preserve">IVA (23%): {iva} €</w:t>
+      </w:r>
+    </w:p>
+    <w:p w14:paraId="MS015TT3" w14:textId="MS015TT3" w:rsidR="00MS0150" w:rsidRDefault="00MS0150">
+      <w:pPr>
+        <w:spacing w:after="60"/>
+      </w:pPr>
+      <w:r>
+        <w:rPr>
           <w:b/>
-          <w:bCs/>
-          <w:sz w:val="24"/>
-          <w:szCs w:val="24"/>
-          <w:u w:val="single"/>
-        </w:rPr>
-        <w:t>10</w:t>
-      </w:r>
-      <w:r>
-        <w:rPr>
-          <w:rFonts w:cs="Times New Roman"/>
-          <w:b/>
-          <w:bCs/>
-          <w:sz w:val="24"/>
-          <w:szCs w:val="24"/>
-          <w:u w:val="single"/>
-        </w:rPr>
-        <w:t xml:space="preserve"> Dias</w:t>
+          <w:sz w:val="22"/>
+          <w:szCs w:val="22"/>
+        </w:rPr>
+        <w:t xml:space="preserve">Total: {total_geral} €</w:t>
       </w:r>
     </w:p>
     <w:p>

</xml_diff>

<commit_message>
Orcamento MS.015: folha 1 com proposta e aprovacao, folha 2 com condicoes legais
Co-authored-by: Cursor <cursoragent@cursor.com>
</commit_message>
<xml_diff>
--- a/pwa/assets/templates/MS.015-orcamento-template.docx
+++ b/pwa/assets/templates/MS.015-orcamento-template.docx
@@ -894,152 +894,6 @@
           <w:p>
             <w:pPr>
               <w:pStyle w:val="SemEspaamento"/>
-              <w:tabs>
-                <w:tab w:val="center" w:pos="2303"/>
-              </w:tabs>
-              <w:rPr>
-                <w:rFonts w:cs="Times New Roman"/>
-                <w:sz w:val="28"/>
-                <w:szCs w:val="28"/>
-              </w:rPr>
-            </w:pPr>
-            <w:r>
-              <w:rPr>
-                <w:rFonts w:cs="Times New Roman"/>
-                <w:sz w:val="28"/>
-                <w:szCs w:val="28"/>
-              </w:rPr>
-              <w:t>Aprovação</w:t>
-            </w:r>
-            <w:r>
-              <w:rPr>
-                <w:rFonts w:cs="Times New Roman"/>
-                <w:sz w:val="28"/>
-                <w:szCs w:val="28"/>
-              </w:rPr>
-              <w:tab/>
-            </w:r>
-          </w:p>
-          <w:p>
-            <w:pPr>
-              <w:pStyle w:val="SemEspaamento"/>
-              <w:rPr>
-                <w:rFonts w:cs="Times New Roman"/>
-                <w:sz w:val="28"/>
-                <w:szCs w:val="28"/>
-              </w:rPr>
-            </w:pPr>
-            <w:r>
-              <w:rPr>
-                <w:rFonts w:cs="Times New Roman"/>
-                <w:sz w:val="28"/>
-                <w:szCs w:val="28"/>
-              </w:rPr>
-              <w:t>Declaro que aceito o presente orçamento e valores apresentados</w:t>
-            </w:r>
-          </w:p>
-          <w:p>
-            <w:pPr>
-              <w:pStyle w:val="SemEspaamento"/>
-              <w:rPr>
-                <w:rFonts w:cs="Times New Roman"/>
-                <w:sz w:val="28"/>
-                <w:szCs w:val="28"/>
-              </w:rPr>
-            </w:pPr>
-          </w:p>
-          <w:p>
-            <w:pPr>
-              <w:pStyle w:val="SemEspaamento"/>
-              <w:jc w:val="right"/>
-              <w:rPr>
-                <w:rFonts w:cs="Times New Roman"/>
-              </w:rPr>
-            </w:pPr>
-          </w:p>
-          <w:p>
-            <w:pPr>
-              <w:pStyle w:val="SemEspaamento"/>
-              <w:jc w:val="right"/>
-              <w:rPr>
-                <w:rFonts w:cs="Times New Roman"/>
-              </w:rPr>
-            </w:pPr>
-          </w:p>
-          <w:p>
-            <w:pPr>
-              <w:pStyle w:val="SemEspaamento"/>
-              <w:jc w:val="right"/>
-              <w:rPr>
-                <w:rFonts w:cs="Times New Roman"/>
-              </w:rPr>
-            </w:pPr>
-          </w:p>
-          <w:p>
-            <w:pPr>
-              <w:pStyle w:val="SemEspaamento"/>
-              <w:rPr>
-                <w:rFonts w:cs="Times New Roman"/>
-              </w:rPr>
-            </w:pPr>
-            <w:r>
-              <w:rPr>
-                <w:rFonts w:cs="Times New Roman"/>
-              </w:rPr>
-              <w:t>(Assinatura e Carimbo)</w:t>
-            </w:r>
-          </w:p>
-        </w:tc>
-        <w:tc>
-          <w:tcPr>
-            <w:tcW w:w="4823" w:type="dxa"/>
-          </w:tcPr>
-          <w:p>
-            <w:pPr>
-              <w:pStyle w:val="SemEspaamento"/>
-              <w:jc w:val="center"/>
-              <w:rPr>
-                <w:rFonts w:cs="Times New Roman"/>
-                <w:sz w:val="28"/>
-                <w:szCs w:val="28"/>
-              </w:rPr>
-            </w:pPr>
-          </w:p>
-          <w:p>
-            <w:pPr>
-              <w:pStyle w:val="SemEspaamento"/>
-              <w:jc w:val="center"/>
-              <w:rPr>
-                <w:rFonts w:cs="Times New Roman"/>
-                <w:sz w:val="28"/>
-                <w:szCs w:val="28"/>
-              </w:rPr>
-            </w:pPr>
-          </w:p>
-          <w:p>
-            <w:pPr>
-              <w:pStyle w:val="SemEspaamento"/>
-              <w:jc w:val="center"/>
-              <w:rPr>
-                <w:rFonts w:cs="Times New Roman"/>
-                <w:sz w:val="28"/>
-                <w:szCs w:val="28"/>
-              </w:rPr>
-            </w:pPr>
-          </w:p>
-          <w:p>
-            <w:pPr>
-              <w:pStyle w:val="SemEspaamento"/>
-              <w:rPr>
-                <w:rFonts w:cs="Times New Roman"/>
-                <w:sz w:val="28"/>
-                <w:szCs w:val="28"/>
-              </w:rPr>
-            </w:pPr>
-          </w:p>
-          <w:p>
-            <w:pPr>
-              <w:pStyle w:val="SemEspaamento"/>
               <w:jc w:val="center"/>
               <w:rPr>
                 <w:rFonts w:cs="Times New Roman"/>
@@ -1096,6 +950,14 @@
             </w:r>
             <w:proofErr w:type="gramEnd"/>
           </w:p>
+          <w:p w14:paraId="MS015AP1" w14:textId="MS015AP1" w:rsidR="00MS0150" w:rsidRDefault="00MS0150">
+            <w:pPr>
+              <w:spacing w:before="160" w:after="0"/>
+            </w:pPr>
+            <w:r>
+              <w:t>[[CAIXA_APROVACAO]]</w:t>
+            </w:r>
+          </w:p>
           <w:p>
             <w:pPr>
               <w:pStyle w:val="SemEspaamento"/>
@@ -1202,6 +1064,11 @@
           <w:szCs w:val="16"/>
         </w:rPr>
       </w:pPr>
+    </w:p>
+    <w:p w14:paraId="MS015PB1" w14:textId="MS015PB1" w:rsidR="00MS0150" w:rsidRDefault="00MS0150">
+      <w:r>
+        <w:br w:type="page"/>
+      </w:r>
     </w:p>
     <w:p/>
     <w:p/>

</xml_diff>